<commit_message>
fixing docx sample variable placeholder
</commit_message>
<xml_diff>
--- a/migration-examples/src/main/resources/exampleResources/docx/04_invoice_statement.docx
+++ b/migration-examples/src/main/resources/exampleResources/docx/04_invoice_statement.docx
@@ -94,10 +94,6 @@
         <w:t xml:space="preserve"> Date: </w:t>
       </w:r>
       <w:r>
-        <w:rPr>
-          <w:b/>
-          <w:bCs/>
-        </w:rPr>
         <w:t>${</w:t>
       </w:r>
       <w:proofErr w:type="spellStart"/>
@@ -148,10 +144,6 @@
         <w:t xml:space="preserve">Bill to: </w:t>
       </w:r>
       <w:r>
-        <w:rPr>
-          <w:b/>
-          <w:bCs/>
-        </w:rPr>
         <w:t>${</w:t>
       </w:r>
       <w:proofErr w:type="spellStart"/>
@@ -199,12 +191,6 @@
         <w:gridCol w:w="1801"/>
       </w:tblGrid>
       <w:tr>
-        <w:tblPrEx>
-          <w:tblCellMar>
-            <w:top w:w="0" w:type="dxa"/>
-            <w:bottom w:w="0" w:type="dxa"/>
-          </w:tblCellMar>
-        </w:tblPrEx>
         <w:trPr>
           <w:tblHeader/>
         </w:trPr>
@@ -283,25 +269,13 @@
         </w:tc>
       </w:tr>
       <w:tr>
-        <w:tblPrEx>
-          <w:tblCellMar>
-            <w:top w:w="0" w:type="dxa"/>
-            <w:bottom w:w="0" w:type="dxa"/>
-          </w:tblCellMar>
-        </w:tblPrEx>
         <w:tc>
           <w:tcPr>
             <w:tcW w:w="4680" w:type="dxa"/>
           </w:tcPr>
           <w:p>
             <w:r>
-              <w:t>${</w:t>
-            </w:r>
-            <w:r>
-              <w:t>LineItem1Desc</w:t>
-            </w:r>
-            <w:r>
-              <w:t>}</w:t>
+              <w:t>${LineItem1Desc}</w:t>
             </w:r>
           </w:p>
         </w:tc>
@@ -314,13 +288,7 @@
               <w:jc w:val="right"/>
             </w:pPr>
             <w:r>
-              <w:t>${</w:t>
-            </w:r>
-            <w:r>
-              <w:t>LineItem1Qty</w:t>
-            </w:r>
-            <w:r>
-              <w:t>}</w:t>
+              <w:t>${LineItem1Qty}</w:t>
             </w:r>
           </w:p>
         </w:tc>
@@ -333,13 +301,7 @@
               <w:jc w:val="right"/>
             </w:pPr>
             <w:r>
-              <w:t>${</w:t>
-            </w:r>
-            <w:r>
-              <w:t>LineItem1Unit</w:t>
-            </w:r>
-            <w:r>
-              <w:t>}</w:t>
+              <w:t>${LineItem1Unit}</w:t>
             </w:r>
           </w:p>
         </w:tc>
@@ -352,24 +314,12 @@
               <w:jc w:val="right"/>
             </w:pPr>
             <w:r>
-              <w:t>${</w:t>
-            </w:r>
-            <w:r>
-              <w:t>LineItem1Amount</w:t>
-            </w:r>
-            <w:r>
-              <w:t>}</w:t>
+              <w:t>${LineItem1Amount}</w:t>
             </w:r>
           </w:p>
         </w:tc>
       </w:tr>
       <w:tr>
-        <w:tblPrEx>
-          <w:tblCellMar>
-            <w:top w:w="0" w:type="dxa"/>
-            <w:bottom w:w="0" w:type="dxa"/>
-          </w:tblCellMar>
-        </w:tblPrEx>
         <w:tc>
           <w:tcPr>
             <w:tcW w:w="4680" w:type="dxa"/>
@@ -377,13 +327,7 @@
           </w:tcPr>
           <w:p>
             <w:r>
-              <w:t>${</w:t>
-            </w:r>
-            <w:r>
-              <w:t>LineItem2Desc</w:t>
-            </w:r>
-            <w:r>
-              <w:t>}</w:t>
+              <w:t>${LineItem2Desc}</w:t>
             </w:r>
           </w:p>
         </w:tc>
@@ -397,13 +341,7 @@
               <w:jc w:val="right"/>
             </w:pPr>
             <w:r>
-              <w:t>${</w:t>
-            </w:r>
-            <w:r>
-              <w:t>LineItem2Qty</w:t>
-            </w:r>
-            <w:r>
-              <w:t>}</w:t>
+              <w:t>${LineItem2Qty}</w:t>
             </w:r>
           </w:p>
         </w:tc>
@@ -417,13 +355,7 @@
               <w:jc w:val="right"/>
             </w:pPr>
             <w:r>
-              <w:t>${</w:t>
-            </w:r>
-            <w:r>
-              <w:t>LineItem2Unit</w:t>
-            </w:r>
-            <w:r>
-              <w:t>}</w:t>
+              <w:t>${LineItem2Unit}</w:t>
             </w:r>
           </w:p>
         </w:tc>
@@ -437,37 +369,19 @@
               <w:jc w:val="right"/>
             </w:pPr>
             <w:r>
-              <w:t>${</w:t>
-            </w:r>
-            <w:r>
-              <w:t>LineItem2Amount</w:t>
-            </w:r>
-            <w:r>
-              <w:t>}</w:t>
+              <w:t>${LineItem2Amount}</w:t>
             </w:r>
           </w:p>
         </w:tc>
       </w:tr>
       <w:tr>
-        <w:tblPrEx>
-          <w:tblCellMar>
-            <w:top w:w="0" w:type="dxa"/>
-            <w:bottom w:w="0" w:type="dxa"/>
-          </w:tblCellMar>
-        </w:tblPrEx>
         <w:tc>
           <w:tcPr>
             <w:tcW w:w="4680" w:type="dxa"/>
           </w:tcPr>
           <w:p>
             <w:r>
-              <w:t>${</w:t>
-            </w:r>
-            <w:r>
-              <w:t>LineItem3Desc</w:t>
-            </w:r>
-            <w:r>
-              <w:t>}</w:t>
+              <w:t>${LineItem3Desc}</w:t>
             </w:r>
           </w:p>
         </w:tc>
@@ -480,13 +394,7 @@
               <w:jc w:val="right"/>
             </w:pPr>
             <w:r>
-              <w:t>${</w:t>
-            </w:r>
-            <w:r>
-              <w:t>LineItem3Qty</w:t>
-            </w:r>
-            <w:r>
-              <w:t>}</w:t>
+              <w:t>${LineItem3Qty}</w:t>
             </w:r>
           </w:p>
         </w:tc>
@@ -499,13 +407,7 @@
               <w:jc w:val="right"/>
             </w:pPr>
             <w:r>
-              <w:t>${</w:t>
-            </w:r>
-            <w:r>
-              <w:t>LineItem3Unit</w:t>
-            </w:r>
-            <w:r>
-              <w:t>}</w:t>
+              <w:t>${LineItem3Unit}</w:t>
             </w:r>
           </w:p>
         </w:tc>
@@ -518,24 +420,12 @@
               <w:jc w:val="right"/>
             </w:pPr>
             <w:r>
-              <w:t>${</w:t>
-            </w:r>
-            <w:r>
-              <w:t>LineItem3Amount</w:t>
-            </w:r>
-            <w:r>
-              <w:t>}</w:t>
+              <w:t>${LineItem3Amount}</w:t>
             </w:r>
           </w:p>
         </w:tc>
       </w:tr>
       <w:tr>
-        <w:tblPrEx>
-          <w:tblCellMar>
-            <w:top w:w="0" w:type="dxa"/>
-            <w:bottom w:w="0" w:type="dxa"/>
-          </w:tblCellMar>
-        </w:tblPrEx>
         <w:tc>
           <w:tcPr>
             <w:tcW w:w="4680" w:type="dxa"/>
@@ -543,13 +433,7 @@
           </w:tcPr>
           <w:p>
             <w:r>
-              <w:t>${</w:t>
-            </w:r>
-            <w:r>
-              <w:t>LineItem4Desc</w:t>
-            </w:r>
-            <w:r>
-              <w:t>}</w:t>
+              <w:t>${LineItem4Desc}</w:t>
             </w:r>
           </w:p>
         </w:tc>
@@ -563,13 +447,7 @@
               <w:jc w:val="right"/>
             </w:pPr>
             <w:r>
-              <w:t>${</w:t>
-            </w:r>
-            <w:r>
-              <w:t>LineItem4Qty</w:t>
-            </w:r>
-            <w:r>
-              <w:t>}</w:t>
+              <w:t>${LineItem4Qty}</w:t>
             </w:r>
           </w:p>
         </w:tc>
@@ -583,13 +461,7 @@
               <w:jc w:val="right"/>
             </w:pPr>
             <w:r>
-              <w:t>${</w:t>
-            </w:r>
-            <w:r>
-              <w:t>LineItem4Unit</w:t>
-            </w:r>
-            <w:r>
-              <w:t>}</w:t>
+              <w:t>${LineItem4Unit}</w:t>
             </w:r>
           </w:p>
         </w:tc>
@@ -603,24 +475,12 @@
               <w:jc w:val="right"/>
             </w:pPr>
             <w:r>
-              <w:t>${</w:t>
-            </w:r>
-            <w:r>
-              <w:t>LineItem4Amount</w:t>
-            </w:r>
-            <w:r>
-              <w:t>}</w:t>
+              <w:t>${LineItem4Amount}</w:t>
             </w:r>
           </w:p>
         </w:tc>
       </w:tr>
       <w:tr>
-        <w:tblPrEx>
-          <w:tblCellMar>
-            <w:top w:w="0" w:type="dxa"/>
-            <w:bottom w:w="0" w:type="dxa"/>
-          </w:tblCellMar>
-        </w:tblPrEx>
         <w:tc>
           <w:tcPr>
             <w:tcW w:w="7800" w:type="dxa"/>

</xml_diff>